<commit_message>
feat: update UI form pengajuan full width & 2-column grid, inline filter bar, and notification timeout
</commit_message>
<xml_diff>
--- a/Template surat/Surat_Keterangan_Tidak_Menerima_Beasiswa.docx
+++ b/Template surat/Surat_Keterangan_Tidak_Menerima_Beasiswa.docx
@@ -1,6 +1,6 @@
 
 <file path=word/document.xml><?xml version="1.0" encoding="utf-8"?>
-<w:document xmlns:wpc="http://schemas.microsoft.com/office/word/2010/wordprocessingCanvas" xmlns:cx="http://schemas.microsoft.com/office/drawing/2014/chartex" xmlns:cx1="http://schemas.microsoft.com/office/drawing/2015/9/8/chartex" xmlns:cx2="http://schemas.microsoft.com/office/drawing/2015/10/21/chartex" xmlns:cx3="http://schemas.microsoft.com/office/drawing/2016/5/9/chartex" xmlns:cx4="http://schemas.microsoft.com/office/drawing/2016/5/10/chartex" xmlns:cx5="http://schemas.microsoft.com/office/drawing/2016/5/11/chartex" xmlns:cx6="http://schemas.microsoft.com/office/drawing/2016/5/12/chartex" xmlns:cx7="http://schemas.microsoft.com/office/drawing/2016/5/13/chartex" xmlns:cx8="http://schemas.microsoft.com/office/drawing/2016/5/14/chartex" xmlns:mc="http://schemas.openxmlformats.org/markup-compatibility/2006" xmlns:aink="http://schemas.microsoft.com/office/drawing/2016/ink" xmlns:am3d="http://schemas.microsoft.com/office/drawing/2017/model3d" xmlns:o="urn:schemas-microsoft-com:office:office" xmlns:oel="http://schemas.microsoft.com/office/2019/extlst" xmlns:r="http://schemas.openxmlformats.org/officeDocument/2006/relationships" xmlns:m="http://schemas.openxmlformats.org/officeDocument/2006/math" xmlns:v="urn:schemas-microsoft-com:vml" xmlns:wp14="http://schemas.microsoft.com/office/word/2010/wordprocessingDrawing" xmlns:wp="http://schemas.openxmlformats.org/drawingml/2006/wordprocessingDrawing" xmlns:w10="urn:schemas-microsoft-com:office:word" xmlns:w="http://schemas.openxmlformats.org/wordprocessingml/2006/main" xmlns:w14="http://schemas.microsoft.com/office/word/2010/wordml" xmlns:w15="http://schemas.microsoft.com/office/word/2012/wordml" xmlns:w16cei="http://schemas.microsoft.com/office/word/2026/wordml/cei" xmlns:w16cex="http://schemas.microsoft.com/office/word/2018/wordml/cex" xmlns:w16cid="http://schemas.microsoft.com/office/word/2016/wordml/cid" xmlns:w16="http://schemas.microsoft.com/office/word/2018/wordml" xmlns:w16du="http://schemas.microsoft.com/office/word/2023/wordml/word16du" xmlns:w16sdtdh="http://schemas.microsoft.com/office/word/2020/wordml/sdtdatahash" xmlns:w16sdtfl="http://schemas.microsoft.com/office/word/2024/wordml/sdtformatlock" xmlns:w16se="http://schemas.microsoft.com/office/word/2015/wordml/symex" xmlns:wpg="http://schemas.microsoft.com/office/word/2010/wordprocessingGroup" xmlns:wpi="http://schemas.microsoft.com/office/word/2010/wordprocessingInk" xmlns:wne="http://schemas.microsoft.com/office/word/2006/wordml" xmlns:wps="http://schemas.microsoft.com/office/word/2010/wordprocessingShape" mc:Ignorable="w14 w15 w16se w16cid w16 w16cex w16sdtdh w16sdtfl w16du wp14">
+<w:document xmlns:wpc="http://schemas.microsoft.com/office/word/2010/wordprocessingCanvas" xmlns:cx="http://schemas.microsoft.com/office/drawing/2014/chartex" xmlns:cx1="http://schemas.microsoft.com/office/drawing/2015/9/8/chartex" xmlns:cx2="http://schemas.microsoft.com/office/drawing/2015/10/21/chartex" xmlns:cx3="http://schemas.microsoft.com/office/drawing/2016/5/9/chartex" xmlns:cx4="http://schemas.microsoft.com/office/drawing/2016/5/10/chartex" xmlns:cx5="http://schemas.microsoft.com/office/drawing/2016/5/11/chartex" xmlns:cx6="http://schemas.microsoft.com/office/drawing/2016/5/12/chartex" xmlns:cx7="http://schemas.microsoft.com/office/drawing/2016/5/13/chartex" xmlns:cx8="http://schemas.microsoft.com/office/drawing/2016/5/14/chartex" xmlns:mc="http://schemas.openxmlformats.org/markup-compatibility/2006" xmlns:aink="http://schemas.microsoft.com/office/drawing/2016/ink" xmlns:am3d="http://schemas.microsoft.com/office/drawing/2017/model3d" xmlns:o="urn:schemas-microsoft-com:office:office" xmlns:oel="http://schemas.microsoft.com/office/2019/extlst" xmlns:r="http://schemas.openxmlformats.org/officeDocument/2006/relationships" xmlns:m="http://schemas.openxmlformats.org/officeDocument/2006/math" xmlns:v="urn:schemas-microsoft-com:vml" xmlns:wp14="http://schemas.microsoft.com/office/word/2010/wordprocessingDrawing" xmlns:wp="http://schemas.openxmlformats.org/drawingml/2006/wordprocessingDrawing" xmlns:w10="urn:schemas-microsoft-com:office:word" xmlns:w="http://schemas.openxmlformats.org/wordprocessingml/2006/main" xmlns:w14="http://schemas.microsoft.com/office/word/2010/wordml" xmlns:w15="http://schemas.microsoft.com/office/word/2012/wordml" xmlns:w16cex="http://schemas.microsoft.com/office/word/2018/wordml/cex" xmlns:w16cid="http://schemas.microsoft.com/office/word/2016/wordml/cid" xmlns:w16="http://schemas.microsoft.com/office/word/2018/wordml" xmlns:w16du="http://schemas.microsoft.com/office/word/2023/wordml/word16du" xmlns:w16sdtdh="http://schemas.microsoft.com/office/word/2020/wordml/sdtdatahash" xmlns:w16se="http://schemas.microsoft.com/office/word/2015/wordml/symex" xmlns:wpg="http://schemas.microsoft.com/office/word/2010/wordprocessingGroup" xmlns:wpi="http://schemas.microsoft.com/office/word/2010/wordprocessingInk" xmlns:wne="http://schemas.microsoft.com/office/word/2006/wordml" xmlns:wps="http://schemas.microsoft.com/office/word/2010/wordprocessingShape" mc:Ignorable="w14 w15 w16se w16cid w16 w16cex w16sdtdh w16du wp14">
   <w:body>
     <w:p>
       <w:pPr>
@@ -76,7 +76,6 @@
           <w:rFonts w:ascii="Times New Roman" w:hAnsi="Times New Roman" w:cs="Times New Roman"/>
           <w:sz w:val="24"/>
           <w:szCs w:val="24"/>
-          <w:lang w:val="fi-FI"/>
         </w:rPr>
       </w:pPr>
       <w:r>
@@ -86,7 +85,6 @@
           <w:sz w:val="24"/>
           <w:szCs w:val="24"/>
           <w:u w:val="single"/>
-          <w:lang w:val="fi-FI"/>
         </w:rPr>
         <w:t xml:space="preserve">SURAT </w:t>
       </w:r>
@@ -97,7 +95,6 @@
           <w:sz w:val="24"/>
           <w:szCs w:val="24"/>
           <w:u w:val="single"/>
-          <w:lang w:val="fi-FI"/>
         </w:rPr>
         <w:t>KETERANGAN TIDAK MENERIMA BEASISWA</w:t>
       </w:r>
@@ -114,7 +111,6 @@
           <w:bCs/>
           <w:sz w:val="24"/>
           <w:szCs w:val="24"/>
-          <w:lang w:val="fi-FI"/>
         </w:rPr>
       </w:pPr>
       <w:r>
@@ -123,9 +119,17 @@
           <w:bCs/>
           <w:sz w:val="24"/>
           <w:szCs w:val="24"/>
-          <w:lang w:val="fi-FI"/>
-        </w:rPr>
-        <w:t>Nomor: ${nomor_surat}/STMIK-BDG/ ${prodi_wk3}/E/${bulan_romawi}/${tahun}</w:t>
+        </w:rPr>
+        <w:t>NOMOR</w:t>
+      </w:r>
+      <w:r>
+        <w:rPr>
+          <w:rFonts w:ascii="Times New Roman" w:hAnsi="Times New Roman" w:cs="Times New Roman"/>
+          <w:bCs/>
+          <w:sz w:val="24"/>
+          <w:szCs w:val="24"/>
+        </w:rPr>
+        <w:t>: ${nomor_surat}/STMIK-BDG/ ${prodi_wk3}/E/${bulan_romawi}/${tahun}</w:t>
       </w:r>
     </w:p>
     <w:p>
@@ -140,7 +144,6 @@
           <w:bCs/>
           <w:sz w:val="24"/>
           <w:szCs w:val="24"/>
-          <w:lang w:val="fi-FI"/>
         </w:rPr>
       </w:pPr>
     </w:p>
@@ -174,15 +177,13 @@
           <w:rFonts w:ascii="Times New Roman" w:hAnsi="Times New Roman" w:cs="Times New Roman"/>
           <w:sz w:val="24"/>
           <w:szCs w:val="24"/>
-          <w:lang w:val="fi-FI"/>
-        </w:rPr>
-      </w:pPr>
-      <w:r>
-        <w:rPr>
-          <w:rFonts w:ascii="Times New Roman" w:hAnsi="Times New Roman" w:cs="Times New Roman"/>
-          <w:sz w:val="24"/>
-          <w:szCs w:val="24"/>
-          <w:lang w:val="fi-FI"/>
+        </w:rPr>
+      </w:pPr>
+      <w:r>
+        <w:rPr>
+          <w:rFonts w:ascii="Times New Roman" w:hAnsi="Times New Roman" w:cs="Times New Roman"/>
+          <w:sz w:val="24"/>
+          <w:szCs w:val="24"/>
         </w:rPr>
         <w:t xml:space="preserve">Nama </w:t>
       </w:r>
@@ -191,7 +192,6 @@
           <w:rFonts w:ascii="Times New Roman" w:hAnsi="Times New Roman" w:cs="Times New Roman"/>
           <w:sz w:val="24"/>
           <w:szCs w:val="24"/>
-          <w:lang w:val="fi-FI"/>
         </w:rPr>
         <w:tab/>
       </w:r>
@@ -200,17 +200,8 @@
           <w:rFonts w:ascii="Times New Roman" w:hAnsi="Times New Roman" w:cs="Times New Roman"/>
           <w:sz w:val="24"/>
           <w:szCs w:val="24"/>
-          <w:lang w:val="fi-FI"/>
         </w:rPr>
         <w:tab/>
-      </w:r>
-      <w:r>
-        <w:rPr>
-          <w:rFonts w:ascii="Times New Roman" w:hAnsi="Times New Roman" w:cs="Times New Roman"/>
-          <w:sz w:val="24"/>
-          <w:szCs w:val="24"/>
-          <w:lang w:val="fi-FI"/>
-        </w:rPr>
         <w:t>: ${nama}</w:t>
       </w:r>
     </w:p>
@@ -222,15 +213,13 @@
           <w:rFonts w:ascii="Times New Roman" w:hAnsi="Times New Roman" w:cs="Times New Roman"/>
           <w:sz w:val="24"/>
           <w:szCs w:val="24"/>
-          <w:lang w:val="fi-FI"/>
-        </w:rPr>
-      </w:pPr>
-      <w:r>
-        <w:rPr>
-          <w:rFonts w:ascii="Times New Roman" w:hAnsi="Times New Roman" w:cs="Times New Roman"/>
-          <w:sz w:val="24"/>
-          <w:szCs w:val="24"/>
-          <w:lang w:val="fi-FI"/>
+        </w:rPr>
+      </w:pPr>
+      <w:r>
+        <w:rPr>
+          <w:rFonts w:ascii="Times New Roman" w:hAnsi="Times New Roman" w:cs="Times New Roman"/>
+          <w:sz w:val="24"/>
+          <w:szCs w:val="24"/>
         </w:rPr>
         <w:t xml:space="preserve">NIM </w:t>
       </w:r>
@@ -239,7 +228,6 @@
           <w:rFonts w:ascii="Times New Roman" w:hAnsi="Times New Roman" w:cs="Times New Roman"/>
           <w:sz w:val="24"/>
           <w:szCs w:val="24"/>
-          <w:lang w:val="fi-FI"/>
         </w:rPr>
         <w:tab/>
       </w:r>
@@ -248,7 +236,6 @@
           <w:rFonts w:ascii="Times New Roman" w:hAnsi="Times New Roman" w:cs="Times New Roman"/>
           <w:sz w:val="24"/>
           <w:szCs w:val="24"/>
-          <w:lang w:val="fi-FI"/>
         </w:rPr>
         <w:tab/>
         <w:t>: ${nim}</w:t>
@@ -262,15 +249,13 @@
           <w:rFonts w:ascii="Times New Roman" w:hAnsi="Times New Roman" w:cs="Times New Roman"/>
           <w:sz w:val="24"/>
           <w:szCs w:val="24"/>
-          <w:lang w:val="fi-FI"/>
-        </w:rPr>
-      </w:pPr>
-      <w:r>
-        <w:rPr>
-          <w:rFonts w:ascii="Times New Roman" w:hAnsi="Times New Roman" w:cs="Times New Roman"/>
-          <w:sz w:val="24"/>
-          <w:szCs w:val="24"/>
-          <w:lang w:val="fi-FI"/>
+        </w:rPr>
+      </w:pPr>
+      <w:r>
+        <w:rPr>
+          <w:rFonts w:ascii="Times New Roman" w:hAnsi="Times New Roman" w:cs="Times New Roman"/>
+          <w:sz w:val="24"/>
+          <w:szCs w:val="24"/>
         </w:rPr>
         <w:t xml:space="preserve">Program Studi </w:t>
       </w:r>
@@ -279,7 +264,6 @@
           <w:rFonts w:ascii="Times New Roman" w:hAnsi="Times New Roman" w:cs="Times New Roman"/>
           <w:sz w:val="24"/>
           <w:szCs w:val="24"/>
-          <w:lang w:val="fi-FI"/>
         </w:rPr>
         <w:tab/>
         <w:t>: ${prodi}</w:t>
@@ -293,7 +277,6 @@
           <w:rFonts w:ascii="Times New Roman" w:hAnsi="Times New Roman" w:cs="Times New Roman"/>
           <w:sz w:val="24"/>
           <w:szCs w:val="24"/>
-          <w:lang w:val="fi-FI"/>
         </w:rPr>
       </w:pPr>
       <w:r>
@@ -326,7 +309,23 @@
           <w:sz w:val="24"/>
           <w:szCs w:val="24"/>
         </w:rPr>
-        <w:t>: ${semester}</w:t>
+        <w:t>: ${</w:t>
+      </w:r>
+      <w:r>
+        <w:rPr>
+          <w:rFonts w:ascii="Times New Roman" w:hAnsi="Times New Roman" w:cs="Times New Roman"/>
+          <w:sz w:val="24"/>
+          <w:szCs w:val="24"/>
+        </w:rPr>
+        <w:t>Semester</w:t>
+      </w:r>
+      <w:r>
+        <w:rPr>
+          <w:rFonts w:ascii="Times New Roman" w:hAnsi="Times New Roman" w:cs="Times New Roman"/>
+          <w:sz w:val="24"/>
+          <w:szCs w:val="24"/>
+        </w:rPr>
+        <w:t>}</w:t>
       </w:r>
     </w:p>
     <w:p>
@@ -384,13 +383,15 @@
           <w:rFonts w:ascii="Times New Roman" w:hAnsi="Times New Roman" w:cs="Times New Roman"/>
           <w:sz w:val="24"/>
           <w:szCs w:val="24"/>
-        </w:rPr>
-      </w:pPr>
-      <w:r>
-        <w:rPr>
-          <w:rFonts w:ascii="Times New Roman" w:hAnsi="Times New Roman" w:cs="Times New Roman"/>
-          <w:sz w:val="24"/>
-          <w:szCs w:val="24"/>
+          <w:lang w:val="fi-FI"/>
+        </w:rPr>
+      </w:pPr>
+      <w:r>
+        <w:rPr>
+          <w:rFonts w:ascii="Times New Roman" w:hAnsi="Times New Roman" w:cs="Times New Roman"/>
+          <w:sz w:val="24"/>
+          <w:szCs w:val="24"/>
+          <w:lang w:val="fi-FI"/>
         </w:rPr>
         <w:t>Surat keterangan ini dibuat untuk digunakan sebagai salah satu persyaratan pengajuan beasiswa pada:</w:t>
       </w:r>
@@ -404,7 +405,6 @@
           <w:rFonts w:ascii="Times New Roman" w:hAnsi="Times New Roman" w:cs="Times New Roman"/>
           <w:sz w:val="24"/>
           <w:szCs w:val="24"/>
-          <w:lang w:val="fi-FI"/>
         </w:rPr>
       </w:pPr>
       <w:r>
@@ -441,7 +441,6 @@
           <w:rFonts w:ascii="Times New Roman" w:hAnsi="Times New Roman" w:cs="Times New Roman"/>
           <w:sz w:val="24"/>
           <w:szCs w:val="24"/>
-          <w:lang w:val="fi-FI"/>
         </w:rPr>
       </w:pPr>
       <w:r>
@@ -622,9 +621,9 @@
                 <w:lang w:val="fi-FI"/>
               </w:rPr>
               <w:drawing>
-                <wp:inline distT="0" distB="0" distL="0" distR="0" wp14:anchorId="0A5FF162" wp14:editId="3498BE01">
+                <wp:inline distT="0" distB="0" distL="0" distR="0" wp14:anchorId="0A5FF162" wp14:editId="774F16A4">
                   <wp:extent cx="1572750" cy="1152939"/>
-                  <wp:effectExtent l="0" t="0" r="8890" b="9525"/>
+                  <wp:effectExtent l="0" t="0" r="0" b="0"/>
                   <wp:docPr id="1704703028" name="Picture 2"/>
                   <wp:cNvGraphicFramePr>
                     <a:graphicFrameLocks xmlns:a="http://schemas.openxmlformats.org/drawingml/2006/main" noChangeAspect="1"/>
@@ -639,6 +638,15 @@
                         <pic:blipFill rotWithShape="1">
                           <a:blip r:embed="rId5">
                             <a:extLst>
+                              <a:ext uri="{BEBA8EAE-BF5A-486C-A8C5-ECC9F3942E4B}">
+                                <a14:imgProps xmlns:a14="http://schemas.microsoft.com/office/drawing/2010/main">
+                                  <a14:imgLayer r:embed="rId6">
+                                    <a14:imgEffect>
+                                      <a14:backgroundRemoval t="20142" b="85523" l="10000" r="90000"/>
+                                    </a14:imgEffect>
+                                  </a14:imgLayer>
+                                </a14:imgProps>
+                              </a:ext>
                               <a:ext uri="{28A0092B-C50C-407E-A947-70E740481C1C}">
                                 <a14:useLocalDpi xmlns:a14="http://schemas.microsoft.com/office/drawing/2010/main" val="0"/>
                               </a:ext>
@@ -738,6 +746,7 @@
           <w:rFonts w:ascii="Times New Roman" w:hAnsi="Times New Roman" w:cs="Times New Roman"/>
           <w:sz w:val="24"/>
           <w:szCs w:val="24"/>
+          <w:lang w:val="fi-FI"/>
         </w:rPr>
       </w:pPr>
     </w:p>
@@ -751,7 +760,7 @@
 </file>
 
 <file path=word/styles.xml><?xml version="1.0" encoding="utf-8"?>
-<w:styles xmlns:mc="http://schemas.openxmlformats.org/markup-compatibility/2006" xmlns:r="http://schemas.openxmlformats.org/officeDocument/2006/relationships" xmlns:w="http://schemas.openxmlformats.org/wordprocessingml/2006/main" xmlns:w14="http://schemas.microsoft.com/office/word/2010/wordml" xmlns:w15="http://schemas.microsoft.com/office/word/2012/wordml" xmlns:w16cex="http://schemas.microsoft.com/office/word/2018/wordml/cex" xmlns:w16cid="http://schemas.microsoft.com/office/word/2016/wordml/cid" xmlns:w16="http://schemas.microsoft.com/office/word/2018/wordml" xmlns:w16du="http://schemas.microsoft.com/office/word/2023/wordml/word16du" xmlns:w16sdtdh="http://schemas.microsoft.com/office/word/2020/wordml/sdtdatahash" xmlns:w16sdtfl="http://schemas.microsoft.com/office/word/2024/wordml/sdtformatlock" xmlns:w16se="http://schemas.microsoft.com/office/word/2015/wordml/symex" mc:Ignorable="w14 w15 w16se w16cid w16 w16cex w16sdtdh w16sdtfl w16du">
+<w:styles xmlns:mc="http://schemas.openxmlformats.org/markup-compatibility/2006" xmlns:r="http://schemas.openxmlformats.org/officeDocument/2006/relationships" xmlns:w="http://schemas.openxmlformats.org/wordprocessingml/2006/main" xmlns:w14="http://schemas.microsoft.com/office/word/2010/wordml" xmlns:w15="http://schemas.microsoft.com/office/word/2012/wordml" xmlns:w16cex="http://schemas.microsoft.com/office/word/2018/wordml/cex" xmlns:w16cid="http://schemas.microsoft.com/office/word/2016/wordml/cid" xmlns:w16="http://schemas.microsoft.com/office/word/2018/wordml" xmlns:w16du="http://schemas.microsoft.com/office/word/2023/wordml/word16du" xmlns:w16sdtdh="http://schemas.microsoft.com/office/word/2020/wordml/sdtdatahash" xmlns:w16se="http://schemas.microsoft.com/office/word/2015/wordml/symex" mc:Ignorable="w14 w15 w16se w16cid w16 w16cex w16sdtdh w16du">
   <w:docDefaults>
     <w:rPrDefault>
       <w:rPr>
@@ -1159,6 +1168,7 @@
   <w:style w:type="character" w:default="1" w:styleId="DefaultParagraphFont">
     <w:name w:val="Default Paragraph Font"/>
     <w:uiPriority w:val="1"/>
+    <w:semiHidden/>
     <w:unhideWhenUsed/>
   </w:style>
   <w:style w:type="table" w:default="1" w:styleId="TableNormal">

</xml_diff>

<commit_message>
fix: nomor surat generation (+1 on ACC), prodi_wk3 mapping, and requirement image preview
</commit_message>
<xml_diff>
--- a/Template surat/Surat_Keterangan_Tidak_Menerima_Beasiswa.docx
+++ b/Template surat/Surat_Keterangan_Tidak_Menerima_Beasiswa.docx
@@ -129,7 +129,67 @@
           <w:sz w:val="24"/>
           <w:szCs w:val="24"/>
         </w:rPr>
-        <w:t>: ${nomor_surat}/STMIK-BDG/ ${prodi_wk3}/E/${bulan_romawi}/${tahun}</w:t>
+        <w:t>: ${</w:t>
+      </w:r>
+      <w:proofErr w:type="spellStart"/>
+      <w:r>
+        <w:rPr>
+          <w:rFonts w:ascii="Times New Roman" w:hAnsi="Times New Roman" w:cs="Times New Roman"/>
+          <w:bCs/>
+          <w:sz w:val="24"/>
+          <w:szCs w:val="24"/>
+        </w:rPr>
+        <w:t>nomor_surat</w:t>
+      </w:r>
+      <w:proofErr w:type="spellEnd"/>
+      <w:r>
+        <w:rPr>
+          <w:rFonts w:ascii="Times New Roman" w:hAnsi="Times New Roman" w:cs="Times New Roman"/>
+          <w:bCs/>
+          <w:sz w:val="24"/>
+          <w:szCs w:val="24"/>
+        </w:rPr>
+        <w:t>}/STMIK-BDG/${prodi_wk3}/E/${</w:t>
+      </w:r>
+      <w:proofErr w:type="spellStart"/>
+      <w:r>
+        <w:rPr>
+          <w:rFonts w:ascii="Times New Roman" w:hAnsi="Times New Roman" w:cs="Times New Roman"/>
+          <w:bCs/>
+          <w:sz w:val="24"/>
+          <w:szCs w:val="24"/>
+        </w:rPr>
+        <w:t>bulan_romawi</w:t>
+      </w:r>
+      <w:proofErr w:type="spellEnd"/>
+      <w:r>
+        <w:rPr>
+          <w:rFonts w:ascii="Times New Roman" w:hAnsi="Times New Roman" w:cs="Times New Roman"/>
+          <w:bCs/>
+          <w:sz w:val="24"/>
+          <w:szCs w:val="24"/>
+        </w:rPr>
+        <w:t>}/${</w:t>
+      </w:r>
+      <w:proofErr w:type="spellStart"/>
+      <w:r>
+        <w:rPr>
+          <w:rFonts w:ascii="Times New Roman" w:hAnsi="Times New Roman" w:cs="Times New Roman"/>
+          <w:bCs/>
+          <w:sz w:val="24"/>
+          <w:szCs w:val="24"/>
+        </w:rPr>
+        <w:t>tahun</w:t>
+      </w:r>
+      <w:proofErr w:type="spellEnd"/>
+      <w:r>
+        <w:rPr>
+          <w:rFonts w:ascii="Times New Roman" w:hAnsi="Times New Roman" w:cs="Times New Roman"/>
+          <w:bCs/>
+          <w:sz w:val="24"/>
+          <w:szCs w:val="24"/>
+        </w:rPr>
+        <w:t>}</w:t>
       </w:r>
     </w:p>
     <w:p>
@@ -166,7 +226,115 @@
           <w:sz w:val="24"/>
           <w:szCs w:val="24"/>
         </w:rPr>
-        <w:t>Yang bertanda tangan di bawah ini menerangkan bahwa:</w:t>
+        <w:t xml:space="preserve">Yang </w:t>
+      </w:r>
+      <w:proofErr w:type="spellStart"/>
+      <w:r>
+        <w:rPr>
+          <w:rFonts w:ascii="Times New Roman" w:hAnsi="Times New Roman" w:cs="Times New Roman"/>
+          <w:sz w:val="24"/>
+          <w:szCs w:val="24"/>
+        </w:rPr>
+        <w:t>bertanda</w:t>
+      </w:r>
+      <w:proofErr w:type="spellEnd"/>
+      <w:r>
+        <w:rPr>
+          <w:rFonts w:ascii="Times New Roman" w:hAnsi="Times New Roman" w:cs="Times New Roman"/>
+          <w:sz w:val="24"/>
+          <w:szCs w:val="24"/>
+        </w:rPr>
+        <w:t xml:space="preserve"> </w:t>
+      </w:r>
+      <w:proofErr w:type="spellStart"/>
+      <w:r>
+        <w:rPr>
+          <w:rFonts w:ascii="Times New Roman" w:hAnsi="Times New Roman" w:cs="Times New Roman"/>
+          <w:sz w:val="24"/>
+          <w:szCs w:val="24"/>
+        </w:rPr>
+        <w:t>tangan</w:t>
+      </w:r>
+      <w:proofErr w:type="spellEnd"/>
+      <w:r>
+        <w:rPr>
+          <w:rFonts w:ascii="Times New Roman" w:hAnsi="Times New Roman" w:cs="Times New Roman"/>
+          <w:sz w:val="24"/>
+          <w:szCs w:val="24"/>
+        </w:rPr>
+        <w:t xml:space="preserve"> di </w:t>
+      </w:r>
+      <w:proofErr w:type="spellStart"/>
+      <w:r>
+        <w:rPr>
+          <w:rFonts w:ascii="Times New Roman" w:hAnsi="Times New Roman" w:cs="Times New Roman"/>
+          <w:sz w:val="24"/>
+          <w:szCs w:val="24"/>
+        </w:rPr>
+        <w:t>bawah</w:t>
+      </w:r>
+      <w:proofErr w:type="spellEnd"/>
+      <w:r>
+        <w:rPr>
+          <w:rFonts w:ascii="Times New Roman" w:hAnsi="Times New Roman" w:cs="Times New Roman"/>
+          <w:sz w:val="24"/>
+          <w:szCs w:val="24"/>
+        </w:rPr>
+        <w:t xml:space="preserve"> </w:t>
+      </w:r>
+      <w:proofErr w:type="spellStart"/>
+      <w:r>
+        <w:rPr>
+          <w:rFonts w:ascii="Times New Roman" w:hAnsi="Times New Roman" w:cs="Times New Roman"/>
+          <w:sz w:val="24"/>
+          <w:szCs w:val="24"/>
+        </w:rPr>
+        <w:t>ini</w:t>
+      </w:r>
+      <w:proofErr w:type="spellEnd"/>
+      <w:r>
+        <w:rPr>
+          <w:rFonts w:ascii="Times New Roman" w:hAnsi="Times New Roman" w:cs="Times New Roman"/>
+          <w:sz w:val="24"/>
+          <w:szCs w:val="24"/>
+        </w:rPr>
+        <w:t xml:space="preserve"> </w:t>
+      </w:r>
+      <w:proofErr w:type="spellStart"/>
+      <w:r>
+        <w:rPr>
+          <w:rFonts w:ascii="Times New Roman" w:hAnsi="Times New Roman" w:cs="Times New Roman"/>
+          <w:sz w:val="24"/>
+          <w:szCs w:val="24"/>
+        </w:rPr>
+        <w:t>menerangkan</w:t>
+      </w:r>
+      <w:proofErr w:type="spellEnd"/>
+      <w:r>
+        <w:rPr>
+          <w:rFonts w:ascii="Times New Roman" w:hAnsi="Times New Roman" w:cs="Times New Roman"/>
+          <w:sz w:val="24"/>
+          <w:szCs w:val="24"/>
+        </w:rPr>
+        <w:t xml:space="preserve"> </w:t>
+      </w:r>
+      <w:proofErr w:type="spellStart"/>
+      <w:r>
+        <w:rPr>
+          <w:rFonts w:ascii="Times New Roman" w:hAnsi="Times New Roman" w:cs="Times New Roman"/>
+          <w:sz w:val="24"/>
+          <w:szCs w:val="24"/>
+        </w:rPr>
+        <w:t>bahwa</w:t>
+      </w:r>
+      <w:proofErr w:type="spellEnd"/>
+      <w:r>
+        <w:rPr>
+          <w:rFonts w:ascii="Times New Roman" w:hAnsi="Times New Roman" w:cs="Times New Roman"/>
+          <w:sz w:val="24"/>
+          <w:szCs w:val="24"/>
+        </w:rPr>
+        <w:t>:</w:t>
       </w:r>
     </w:p>
     <w:p>
@@ -202,7 +370,25 @@
           <w:szCs w:val="24"/>
         </w:rPr>
         <w:tab/>
-        <w:t>: ${nama}</w:t>
+        <w:t>: ${</w:t>
+      </w:r>
+      <w:proofErr w:type="spellStart"/>
+      <w:r>
+        <w:rPr>
+          <w:rFonts w:ascii="Times New Roman" w:hAnsi="Times New Roman" w:cs="Times New Roman"/>
+          <w:sz w:val="24"/>
+          <w:szCs w:val="24"/>
+        </w:rPr>
+        <w:t>nama</w:t>
+      </w:r>
+      <w:proofErr w:type="spellEnd"/>
+      <w:r>
+        <w:rPr>
+          <w:rFonts w:ascii="Times New Roman" w:hAnsi="Times New Roman" w:cs="Times New Roman"/>
+          <w:sz w:val="24"/>
+          <w:szCs w:val="24"/>
+        </w:rPr>
+        <w:t>}</w:t>
       </w:r>
     </w:p>
     <w:p>
@@ -238,7 +424,25 @@
           <w:szCs w:val="24"/>
         </w:rPr>
         <w:tab/>
-        <w:t>: ${nim}</w:t>
+        <w:t>: ${</w:t>
+      </w:r>
+      <w:proofErr w:type="spellStart"/>
+      <w:r>
+        <w:rPr>
+          <w:rFonts w:ascii="Times New Roman" w:hAnsi="Times New Roman" w:cs="Times New Roman"/>
+          <w:sz w:val="24"/>
+          <w:szCs w:val="24"/>
+        </w:rPr>
+        <w:t>nim</w:t>
+      </w:r>
+      <w:proofErr w:type="spellEnd"/>
+      <w:r>
+        <w:rPr>
+          <w:rFonts w:ascii="Times New Roman" w:hAnsi="Times New Roman" w:cs="Times New Roman"/>
+          <w:sz w:val="24"/>
+          <w:szCs w:val="24"/>
+        </w:rPr>
+        <w:t>}</w:t>
       </w:r>
     </w:p>
     <w:p>
@@ -266,7 +470,25 @@
           <w:szCs w:val="24"/>
         </w:rPr>
         <w:tab/>
-        <w:t>: ${prodi}</w:t>
+        <w:t>: ${</w:t>
+      </w:r>
+      <w:proofErr w:type="spellStart"/>
+      <w:r>
+        <w:rPr>
+          <w:rFonts w:ascii="Times New Roman" w:hAnsi="Times New Roman" w:cs="Times New Roman"/>
+          <w:sz w:val="24"/>
+          <w:szCs w:val="24"/>
+        </w:rPr>
+        <w:t>prodi</w:t>
+      </w:r>
+      <w:proofErr w:type="spellEnd"/>
+      <w:r>
+        <w:rPr>
+          <w:rFonts w:ascii="Times New Roman" w:hAnsi="Times New Roman" w:cs="Times New Roman"/>
+          <w:sz w:val="24"/>
+          <w:szCs w:val="24"/>
+        </w:rPr>
+        <w:t>}</w:t>
       </w:r>
     </w:p>
     <w:p>
@@ -341,13 +563,77 @@
           <w:szCs w:val="24"/>
         </w:rPr>
       </w:pPr>
-      <w:r>
-        <w:rPr>
-          <w:rFonts w:ascii="Times New Roman" w:hAnsi="Times New Roman" w:cs="Times New Roman"/>
-          <w:sz w:val="24"/>
-          <w:szCs w:val="24"/>
-        </w:rPr>
-        <w:t>adalah benar mahasiswa aktif STMIK Bandung.</w:t>
+      <w:proofErr w:type="spellStart"/>
+      <w:r>
+        <w:rPr>
+          <w:rFonts w:ascii="Times New Roman" w:hAnsi="Times New Roman" w:cs="Times New Roman"/>
+          <w:sz w:val="24"/>
+          <w:szCs w:val="24"/>
+        </w:rPr>
+        <w:t>adalah</w:t>
+      </w:r>
+      <w:proofErr w:type="spellEnd"/>
+      <w:r>
+        <w:rPr>
+          <w:rFonts w:ascii="Times New Roman" w:hAnsi="Times New Roman" w:cs="Times New Roman"/>
+          <w:sz w:val="24"/>
+          <w:szCs w:val="24"/>
+        </w:rPr>
+        <w:t xml:space="preserve"> </w:t>
+      </w:r>
+      <w:proofErr w:type="spellStart"/>
+      <w:r>
+        <w:rPr>
+          <w:rFonts w:ascii="Times New Roman" w:hAnsi="Times New Roman" w:cs="Times New Roman"/>
+          <w:sz w:val="24"/>
+          <w:szCs w:val="24"/>
+        </w:rPr>
+        <w:t>benar</w:t>
+      </w:r>
+      <w:proofErr w:type="spellEnd"/>
+      <w:r>
+        <w:rPr>
+          <w:rFonts w:ascii="Times New Roman" w:hAnsi="Times New Roman" w:cs="Times New Roman"/>
+          <w:sz w:val="24"/>
+          <w:szCs w:val="24"/>
+        </w:rPr>
+        <w:t xml:space="preserve"> </w:t>
+      </w:r>
+      <w:proofErr w:type="spellStart"/>
+      <w:r>
+        <w:rPr>
+          <w:rFonts w:ascii="Times New Roman" w:hAnsi="Times New Roman" w:cs="Times New Roman"/>
+          <w:sz w:val="24"/>
+          <w:szCs w:val="24"/>
+        </w:rPr>
+        <w:t>mahasiswa</w:t>
+      </w:r>
+      <w:proofErr w:type="spellEnd"/>
+      <w:r>
+        <w:rPr>
+          <w:rFonts w:ascii="Times New Roman" w:hAnsi="Times New Roman" w:cs="Times New Roman"/>
+          <w:sz w:val="24"/>
+          <w:szCs w:val="24"/>
+        </w:rPr>
+        <w:t xml:space="preserve"> </w:t>
+      </w:r>
+      <w:proofErr w:type="spellStart"/>
+      <w:r>
+        <w:rPr>
+          <w:rFonts w:ascii="Times New Roman" w:hAnsi="Times New Roman" w:cs="Times New Roman"/>
+          <w:sz w:val="24"/>
+          <w:szCs w:val="24"/>
+        </w:rPr>
+        <w:t>aktif</w:t>
+      </w:r>
+      <w:proofErr w:type="spellEnd"/>
+      <w:r>
+        <w:rPr>
+          <w:rFonts w:ascii="Times New Roman" w:hAnsi="Times New Roman" w:cs="Times New Roman"/>
+          <w:sz w:val="24"/>
+          <w:szCs w:val="24"/>
+        </w:rPr>
+        <w:t xml:space="preserve"> STMIK Bandung.</w:t>
       </w:r>
     </w:p>
     <w:p>
@@ -363,13 +649,365 @@
           <w:szCs w:val="24"/>
         </w:rPr>
       </w:pPr>
-      <w:r>
-        <w:rPr>
-          <w:rFonts w:ascii="Times New Roman" w:hAnsi="Times New Roman" w:cs="Times New Roman"/>
-          <w:sz w:val="24"/>
-          <w:szCs w:val="24"/>
-        </w:rPr>
-        <w:t>Berdasarkan data administrasi dan kemahasiswaan yang kami miliki, mahasiswa yang bersangkutan sampai dengan surat keterangan ini diterbitkan dinyatakan tidak sedang menerima beasiswa yang diselenggarakan atau dikelola oleh STMIK Bandung.</w:t>
+      <w:proofErr w:type="spellStart"/>
+      <w:r>
+        <w:rPr>
+          <w:rFonts w:ascii="Times New Roman" w:hAnsi="Times New Roman" w:cs="Times New Roman"/>
+          <w:sz w:val="24"/>
+          <w:szCs w:val="24"/>
+        </w:rPr>
+        <w:t>Berdasarkan</w:t>
+      </w:r>
+      <w:proofErr w:type="spellEnd"/>
+      <w:r>
+        <w:rPr>
+          <w:rFonts w:ascii="Times New Roman" w:hAnsi="Times New Roman" w:cs="Times New Roman"/>
+          <w:sz w:val="24"/>
+          <w:szCs w:val="24"/>
+        </w:rPr>
+        <w:t xml:space="preserve"> data </w:t>
+      </w:r>
+      <w:proofErr w:type="spellStart"/>
+      <w:r>
+        <w:rPr>
+          <w:rFonts w:ascii="Times New Roman" w:hAnsi="Times New Roman" w:cs="Times New Roman"/>
+          <w:sz w:val="24"/>
+          <w:szCs w:val="24"/>
+        </w:rPr>
+        <w:t>administrasi</w:t>
+      </w:r>
+      <w:proofErr w:type="spellEnd"/>
+      <w:r>
+        <w:rPr>
+          <w:rFonts w:ascii="Times New Roman" w:hAnsi="Times New Roman" w:cs="Times New Roman"/>
+          <w:sz w:val="24"/>
+          <w:szCs w:val="24"/>
+        </w:rPr>
+        <w:t xml:space="preserve"> dan </w:t>
+      </w:r>
+      <w:proofErr w:type="spellStart"/>
+      <w:r>
+        <w:rPr>
+          <w:rFonts w:ascii="Times New Roman" w:hAnsi="Times New Roman" w:cs="Times New Roman"/>
+          <w:sz w:val="24"/>
+          <w:szCs w:val="24"/>
+        </w:rPr>
+        <w:t>kemahasiswaan</w:t>
+      </w:r>
+      <w:proofErr w:type="spellEnd"/>
+      <w:r>
+        <w:rPr>
+          <w:rFonts w:ascii="Times New Roman" w:hAnsi="Times New Roman" w:cs="Times New Roman"/>
+          <w:sz w:val="24"/>
+          <w:szCs w:val="24"/>
+        </w:rPr>
+        <w:t xml:space="preserve"> yang kami </w:t>
+      </w:r>
+      <w:proofErr w:type="spellStart"/>
+      <w:r>
+        <w:rPr>
+          <w:rFonts w:ascii="Times New Roman" w:hAnsi="Times New Roman" w:cs="Times New Roman"/>
+          <w:sz w:val="24"/>
+          <w:szCs w:val="24"/>
+        </w:rPr>
+        <w:t>miliki</w:t>
+      </w:r>
+      <w:proofErr w:type="spellEnd"/>
+      <w:r>
+        <w:rPr>
+          <w:rFonts w:ascii="Times New Roman" w:hAnsi="Times New Roman" w:cs="Times New Roman"/>
+          <w:sz w:val="24"/>
+          <w:szCs w:val="24"/>
+        </w:rPr>
+        <w:t xml:space="preserve">, </w:t>
+      </w:r>
+      <w:proofErr w:type="spellStart"/>
+      <w:r>
+        <w:rPr>
+          <w:rFonts w:ascii="Times New Roman" w:hAnsi="Times New Roman" w:cs="Times New Roman"/>
+          <w:sz w:val="24"/>
+          <w:szCs w:val="24"/>
+        </w:rPr>
+        <w:t>mahasiswa</w:t>
+      </w:r>
+      <w:proofErr w:type="spellEnd"/>
+      <w:r>
+        <w:rPr>
+          <w:rFonts w:ascii="Times New Roman" w:hAnsi="Times New Roman" w:cs="Times New Roman"/>
+          <w:sz w:val="24"/>
+          <w:szCs w:val="24"/>
+        </w:rPr>
+        <w:t xml:space="preserve"> yang </w:t>
+      </w:r>
+      <w:proofErr w:type="spellStart"/>
+      <w:r>
+        <w:rPr>
+          <w:rFonts w:ascii="Times New Roman" w:hAnsi="Times New Roman" w:cs="Times New Roman"/>
+          <w:sz w:val="24"/>
+          <w:szCs w:val="24"/>
+        </w:rPr>
+        <w:t>bersangkutan</w:t>
+      </w:r>
+      <w:proofErr w:type="spellEnd"/>
+      <w:r>
+        <w:rPr>
+          <w:rFonts w:ascii="Times New Roman" w:hAnsi="Times New Roman" w:cs="Times New Roman"/>
+          <w:sz w:val="24"/>
+          <w:szCs w:val="24"/>
+        </w:rPr>
+        <w:t xml:space="preserve"> </w:t>
+      </w:r>
+      <w:proofErr w:type="spellStart"/>
+      <w:r>
+        <w:rPr>
+          <w:rFonts w:ascii="Times New Roman" w:hAnsi="Times New Roman" w:cs="Times New Roman"/>
+          <w:sz w:val="24"/>
+          <w:szCs w:val="24"/>
+        </w:rPr>
+        <w:t>sampai</w:t>
+      </w:r>
+      <w:proofErr w:type="spellEnd"/>
+      <w:r>
+        <w:rPr>
+          <w:rFonts w:ascii="Times New Roman" w:hAnsi="Times New Roman" w:cs="Times New Roman"/>
+          <w:sz w:val="24"/>
+          <w:szCs w:val="24"/>
+        </w:rPr>
+        <w:t xml:space="preserve"> </w:t>
+      </w:r>
+      <w:proofErr w:type="spellStart"/>
+      <w:r>
+        <w:rPr>
+          <w:rFonts w:ascii="Times New Roman" w:hAnsi="Times New Roman" w:cs="Times New Roman"/>
+          <w:sz w:val="24"/>
+          <w:szCs w:val="24"/>
+        </w:rPr>
+        <w:t>dengan</w:t>
+      </w:r>
+      <w:proofErr w:type="spellEnd"/>
+      <w:r>
+        <w:rPr>
+          <w:rFonts w:ascii="Times New Roman" w:hAnsi="Times New Roman" w:cs="Times New Roman"/>
+          <w:sz w:val="24"/>
+          <w:szCs w:val="24"/>
+        </w:rPr>
+        <w:t xml:space="preserve"> </w:t>
+      </w:r>
+      <w:proofErr w:type="spellStart"/>
+      <w:r>
+        <w:rPr>
+          <w:rFonts w:ascii="Times New Roman" w:hAnsi="Times New Roman" w:cs="Times New Roman"/>
+          <w:sz w:val="24"/>
+          <w:szCs w:val="24"/>
+        </w:rPr>
+        <w:t>surat</w:t>
+      </w:r>
+      <w:proofErr w:type="spellEnd"/>
+      <w:r>
+        <w:rPr>
+          <w:rFonts w:ascii="Times New Roman" w:hAnsi="Times New Roman" w:cs="Times New Roman"/>
+          <w:sz w:val="24"/>
+          <w:szCs w:val="24"/>
+        </w:rPr>
+        <w:t xml:space="preserve"> </w:t>
+      </w:r>
+      <w:proofErr w:type="spellStart"/>
+      <w:r>
+        <w:rPr>
+          <w:rFonts w:ascii="Times New Roman" w:hAnsi="Times New Roman" w:cs="Times New Roman"/>
+          <w:sz w:val="24"/>
+          <w:szCs w:val="24"/>
+        </w:rPr>
+        <w:t>keterangan</w:t>
+      </w:r>
+      <w:proofErr w:type="spellEnd"/>
+      <w:r>
+        <w:rPr>
+          <w:rFonts w:ascii="Times New Roman" w:hAnsi="Times New Roman" w:cs="Times New Roman"/>
+          <w:sz w:val="24"/>
+          <w:szCs w:val="24"/>
+        </w:rPr>
+        <w:t xml:space="preserve"> </w:t>
+      </w:r>
+      <w:proofErr w:type="spellStart"/>
+      <w:r>
+        <w:rPr>
+          <w:rFonts w:ascii="Times New Roman" w:hAnsi="Times New Roman" w:cs="Times New Roman"/>
+          <w:sz w:val="24"/>
+          <w:szCs w:val="24"/>
+        </w:rPr>
+        <w:t>ini</w:t>
+      </w:r>
+      <w:proofErr w:type="spellEnd"/>
+      <w:r>
+        <w:rPr>
+          <w:rFonts w:ascii="Times New Roman" w:hAnsi="Times New Roman" w:cs="Times New Roman"/>
+          <w:sz w:val="24"/>
+          <w:szCs w:val="24"/>
+        </w:rPr>
+        <w:t xml:space="preserve"> </w:t>
+      </w:r>
+      <w:proofErr w:type="spellStart"/>
+      <w:r>
+        <w:rPr>
+          <w:rFonts w:ascii="Times New Roman" w:hAnsi="Times New Roman" w:cs="Times New Roman"/>
+          <w:sz w:val="24"/>
+          <w:szCs w:val="24"/>
+        </w:rPr>
+        <w:t>diterbitkan</w:t>
+      </w:r>
+      <w:proofErr w:type="spellEnd"/>
+      <w:r>
+        <w:rPr>
+          <w:rFonts w:ascii="Times New Roman" w:hAnsi="Times New Roman" w:cs="Times New Roman"/>
+          <w:sz w:val="24"/>
+          <w:szCs w:val="24"/>
+        </w:rPr>
+        <w:t xml:space="preserve"> </w:t>
+      </w:r>
+      <w:proofErr w:type="spellStart"/>
+      <w:r>
+        <w:rPr>
+          <w:rFonts w:ascii="Times New Roman" w:hAnsi="Times New Roman" w:cs="Times New Roman"/>
+          <w:sz w:val="24"/>
+          <w:szCs w:val="24"/>
+        </w:rPr>
+        <w:t>dinyatakan</w:t>
+      </w:r>
+      <w:proofErr w:type="spellEnd"/>
+      <w:r>
+        <w:rPr>
+          <w:rFonts w:ascii="Times New Roman" w:hAnsi="Times New Roman" w:cs="Times New Roman"/>
+          <w:sz w:val="24"/>
+          <w:szCs w:val="24"/>
+        </w:rPr>
+        <w:t xml:space="preserve"> </w:t>
+      </w:r>
+      <w:proofErr w:type="spellStart"/>
+      <w:r>
+        <w:rPr>
+          <w:rFonts w:ascii="Times New Roman" w:hAnsi="Times New Roman" w:cs="Times New Roman"/>
+          <w:sz w:val="24"/>
+          <w:szCs w:val="24"/>
+        </w:rPr>
+        <w:t>tidak</w:t>
+      </w:r>
+      <w:proofErr w:type="spellEnd"/>
+      <w:r>
+        <w:rPr>
+          <w:rFonts w:ascii="Times New Roman" w:hAnsi="Times New Roman" w:cs="Times New Roman"/>
+          <w:sz w:val="24"/>
+          <w:szCs w:val="24"/>
+        </w:rPr>
+        <w:t xml:space="preserve"> </w:t>
+      </w:r>
+      <w:proofErr w:type="spellStart"/>
+      <w:r>
+        <w:rPr>
+          <w:rFonts w:ascii="Times New Roman" w:hAnsi="Times New Roman" w:cs="Times New Roman"/>
+          <w:sz w:val="24"/>
+          <w:szCs w:val="24"/>
+        </w:rPr>
+        <w:t>sedang</w:t>
+      </w:r>
+      <w:proofErr w:type="spellEnd"/>
+      <w:r>
+        <w:rPr>
+          <w:rFonts w:ascii="Times New Roman" w:hAnsi="Times New Roman" w:cs="Times New Roman"/>
+          <w:sz w:val="24"/>
+          <w:szCs w:val="24"/>
+        </w:rPr>
+        <w:t xml:space="preserve"> </w:t>
+      </w:r>
+      <w:proofErr w:type="spellStart"/>
+      <w:r>
+        <w:rPr>
+          <w:rFonts w:ascii="Times New Roman" w:hAnsi="Times New Roman" w:cs="Times New Roman"/>
+          <w:sz w:val="24"/>
+          <w:szCs w:val="24"/>
+        </w:rPr>
+        <w:t>menerima</w:t>
+      </w:r>
+      <w:proofErr w:type="spellEnd"/>
+      <w:r>
+        <w:rPr>
+          <w:rFonts w:ascii="Times New Roman" w:hAnsi="Times New Roman" w:cs="Times New Roman"/>
+          <w:sz w:val="24"/>
+          <w:szCs w:val="24"/>
+        </w:rPr>
+        <w:t xml:space="preserve"> </w:t>
+      </w:r>
+      <w:proofErr w:type="spellStart"/>
+      <w:r>
+        <w:rPr>
+          <w:rFonts w:ascii="Times New Roman" w:hAnsi="Times New Roman" w:cs="Times New Roman"/>
+          <w:sz w:val="24"/>
+          <w:szCs w:val="24"/>
+        </w:rPr>
+        <w:t>beasiswa</w:t>
+      </w:r>
+      <w:proofErr w:type="spellEnd"/>
+      <w:r>
+        <w:rPr>
+          <w:rFonts w:ascii="Times New Roman" w:hAnsi="Times New Roman" w:cs="Times New Roman"/>
+          <w:sz w:val="24"/>
+          <w:szCs w:val="24"/>
+        </w:rPr>
+        <w:t xml:space="preserve"> yang </w:t>
+      </w:r>
+      <w:proofErr w:type="spellStart"/>
+      <w:r>
+        <w:rPr>
+          <w:rFonts w:ascii="Times New Roman" w:hAnsi="Times New Roman" w:cs="Times New Roman"/>
+          <w:sz w:val="24"/>
+          <w:szCs w:val="24"/>
+        </w:rPr>
+        <w:t>diselenggarakan</w:t>
+      </w:r>
+      <w:proofErr w:type="spellEnd"/>
+      <w:r>
+        <w:rPr>
+          <w:rFonts w:ascii="Times New Roman" w:hAnsi="Times New Roman" w:cs="Times New Roman"/>
+          <w:sz w:val="24"/>
+          <w:szCs w:val="24"/>
+        </w:rPr>
+        <w:t xml:space="preserve"> </w:t>
+      </w:r>
+      <w:proofErr w:type="spellStart"/>
+      <w:r>
+        <w:rPr>
+          <w:rFonts w:ascii="Times New Roman" w:hAnsi="Times New Roman" w:cs="Times New Roman"/>
+          <w:sz w:val="24"/>
+          <w:szCs w:val="24"/>
+        </w:rPr>
+        <w:t>atau</w:t>
+      </w:r>
+      <w:proofErr w:type="spellEnd"/>
+      <w:r>
+        <w:rPr>
+          <w:rFonts w:ascii="Times New Roman" w:hAnsi="Times New Roman" w:cs="Times New Roman"/>
+          <w:sz w:val="24"/>
+          <w:szCs w:val="24"/>
+        </w:rPr>
+        <w:t xml:space="preserve"> </w:t>
+      </w:r>
+      <w:proofErr w:type="spellStart"/>
+      <w:r>
+        <w:rPr>
+          <w:rFonts w:ascii="Times New Roman" w:hAnsi="Times New Roman" w:cs="Times New Roman"/>
+          <w:sz w:val="24"/>
+          <w:szCs w:val="24"/>
+        </w:rPr>
+        <w:t>dikelola</w:t>
+      </w:r>
+      <w:proofErr w:type="spellEnd"/>
+      <w:r>
+        <w:rPr>
+          <w:rFonts w:ascii="Times New Roman" w:hAnsi="Times New Roman" w:cs="Times New Roman"/>
+          <w:sz w:val="24"/>
+          <w:szCs w:val="24"/>
+        </w:rPr>
+        <w:t xml:space="preserve"> oleh STMIK Bandung.</w:t>
       </w:r>
     </w:p>
     <w:p>
@@ -413,8 +1051,18 @@
           <w:sz w:val="24"/>
           <w:szCs w:val="24"/>
         </w:rPr>
-        <w:t>Nama Penyelenggara</w:t>
-      </w:r>
+        <w:t xml:space="preserve">Nama </w:t>
+      </w:r>
+      <w:proofErr w:type="spellStart"/>
+      <w:r>
+        <w:rPr>
+          <w:rFonts w:ascii="Times New Roman" w:hAnsi="Times New Roman" w:cs="Times New Roman"/>
+          <w:sz w:val="24"/>
+          <w:szCs w:val="24"/>
+        </w:rPr>
+        <w:t>Penyelenggara</w:t>
+      </w:r>
+      <w:proofErr w:type="spellEnd"/>
       <w:r>
         <w:rPr>
           <w:rFonts w:ascii="Times New Roman" w:hAnsi="Times New Roman" w:cs="Times New Roman"/>
@@ -429,7 +1077,25 @@
           <w:sz w:val="24"/>
           <w:szCs w:val="24"/>
         </w:rPr>
-        <w:t>: ${Penyelenggara_Beasiswa}</w:t>
+        <w:t>: ${</w:t>
+      </w:r>
+      <w:proofErr w:type="spellStart"/>
+      <w:r>
+        <w:rPr>
+          <w:rFonts w:ascii="Times New Roman" w:hAnsi="Times New Roman" w:cs="Times New Roman"/>
+          <w:sz w:val="24"/>
+          <w:szCs w:val="24"/>
+        </w:rPr>
+        <w:t>Penyelenggara_Beasiswa</w:t>
+      </w:r>
+      <w:proofErr w:type="spellEnd"/>
+      <w:r>
+        <w:rPr>
+          <w:rFonts w:ascii="Times New Roman" w:hAnsi="Times New Roman" w:cs="Times New Roman"/>
+          <w:sz w:val="24"/>
+          <w:szCs w:val="24"/>
+        </w:rPr>
+        <w:t>}</w:t>
       </w:r>
     </w:p>
     <w:p>
@@ -473,7 +1139,25 @@
           <w:sz w:val="24"/>
           <w:szCs w:val="24"/>
         </w:rPr>
-        <w:t>: ${Program_Beasiswa}</w:t>
+        <w:t>: ${</w:t>
+      </w:r>
+      <w:proofErr w:type="spellStart"/>
+      <w:r>
+        <w:rPr>
+          <w:rFonts w:ascii="Times New Roman" w:hAnsi="Times New Roman" w:cs="Times New Roman"/>
+          <w:sz w:val="24"/>
+          <w:szCs w:val="24"/>
+        </w:rPr>
+        <w:t>Program_Beasiswa</w:t>
+      </w:r>
+      <w:proofErr w:type="spellEnd"/>
+      <w:r>
+        <w:rPr>
+          <w:rFonts w:ascii="Times New Roman" w:hAnsi="Times New Roman" w:cs="Times New Roman"/>
+          <w:sz w:val="24"/>
+          <w:szCs w:val="24"/>
+        </w:rPr>
+        <w:t>}</w:t>
       </w:r>
     </w:p>
     <w:p>
@@ -489,13 +1173,203 @@
           <w:szCs w:val="24"/>
         </w:rPr>
       </w:pPr>
-      <w:r>
-        <w:rPr>
-          <w:rFonts w:ascii="Times New Roman" w:hAnsi="Times New Roman" w:cs="Times New Roman"/>
-          <w:sz w:val="24"/>
-          <w:szCs w:val="24"/>
-        </w:rPr>
-        <w:t>Demikian surat keterangan ini dibuat dengan sebenarnya agar dapat dipergunakan sebagaimana mestinya.</w:t>
+      <w:proofErr w:type="spellStart"/>
+      <w:r>
+        <w:rPr>
+          <w:rFonts w:ascii="Times New Roman" w:hAnsi="Times New Roman" w:cs="Times New Roman"/>
+          <w:sz w:val="24"/>
+          <w:szCs w:val="24"/>
+        </w:rPr>
+        <w:t>Demikian</w:t>
+      </w:r>
+      <w:proofErr w:type="spellEnd"/>
+      <w:r>
+        <w:rPr>
+          <w:rFonts w:ascii="Times New Roman" w:hAnsi="Times New Roman" w:cs="Times New Roman"/>
+          <w:sz w:val="24"/>
+          <w:szCs w:val="24"/>
+        </w:rPr>
+        <w:t xml:space="preserve"> </w:t>
+      </w:r>
+      <w:proofErr w:type="spellStart"/>
+      <w:r>
+        <w:rPr>
+          <w:rFonts w:ascii="Times New Roman" w:hAnsi="Times New Roman" w:cs="Times New Roman"/>
+          <w:sz w:val="24"/>
+          <w:szCs w:val="24"/>
+        </w:rPr>
+        <w:t>surat</w:t>
+      </w:r>
+      <w:proofErr w:type="spellEnd"/>
+      <w:r>
+        <w:rPr>
+          <w:rFonts w:ascii="Times New Roman" w:hAnsi="Times New Roman" w:cs="Times New Roman"/>
+          <w:sz w:val="24"/>
+          <w:szCs w:val="24"/>
+        </w:rPr>
+        <w:t xml:space="preserve"> </w:t>
+      </w:r>
+      <w:proofErr w:type="spellStart"/>
+      <w:r>
+        <w:rPr>
+          <w:rFonts w:ascii="Times New Roman" w:hAnsi="Times New Roman" w:cs="Times New Roman"/>
+          <w:sz w:val="24"/>
+          <w:szCs w:val="24"/>
+        </w:rPr>
+        <w:t>keterangan</w:t>
+      </w:r>
+      <w:proofErr w:type="spellEnd"/>
+      <w:r>
+        <w:rPr>
+          <w:rFonts w:ascii="Times New Roman" w:hAnsi="Times New Roman" w:cs="Times New Roman"/>
+          <w:sz w:val="24"/>
+          <w:szCs w:val="24"/>
+        </w:rPr>
+        <w:t xml:space="preserve"> </w:t>
+      </w:r>
+      <w:proofErr w:type="spellStart"/>
+      <w:r>
+        <w:rPr>
+          <w:rFonts w:ascii="Times New Roman" w:hAnsi="Times New Roman" w:cs="Times New Roman"/>
+          <w:sz w:val="24"/>
+          <w:szCs w:val="24"/>
+        </w:rPr>
+        <w:t>ini</w:t>
+      </w:r>
+      <w:proofErr w:type="spellEnd"/>
+      <w:r>
+        <w:rPr>
+          <w:rFonts w:ascii="Times New Roman" w:hAnsi="Times New Roman" w:cs="Times New Roman"/>
+          <w:sz w:val="24"/>
+          <w:szCs w:val="24"/>
+        </w:rPr>
+        <w:t xml:space="preserve"> </w:t>
+      </w:r>
+      <w:proofErr w:type="spellStart"/>
+      <w:r>
+        <w:rPr>
+          <w:rFonts w:ascii="Times New Roman" w:hAnsi="Times New Roman" w:cs="Times New Roman"/>
+          <w:sz w:val="24"/>
+          <w:szCs w:val="24"/>
+        </w:rPr>
+        <w:t>dibuat</w:t>
+      </w:r>
+      <w:proofErr w:type="spellEnd"/>
+      <w:r>
+        <w:rPr>
+          <w:rFonts w:ascii="Times New Roman" w:hAnsi="Times New Roman" w:cs="Times New Roman"/>
+          <w:sz w:val="24"/>
+          <w:szCs w:val="24"/>
+        </w:rPr>
+        <w:t xml:space="preserve"> </w:t>
+      </w:r>
+      <w:proofErr w:type="spellStart"/>
+      <w:r>
+        <w:rPr>
+          <w:rFonts w:ascii="Times New Roman" w:hAnsi="Times New Roman" w:cs="Times New Roman"/>
+          <w:sz w:val="24"/>
+          <w:szCs w:val="24"/>
+        </w:rPr>
+        <w:t>dengan</w:t>
+      </w:r>
+      <w:proofErr w:type="spellEnd"/>
+      <w:r>
+        <w:rPr>
+          <w:rFonts w:ascii="Times New Roman" w:hAnsi="Times New Roman" w:cs="Times New Roman"/>
+          <w:sz w:val="24"/>
+          <w:szCs w:val="24"/>
+        </w:rPr>
+        <w:t xml:space="preserve"> </w:t>
+      </w:r>
+      <w:proofErr w:type="spellStart"/>
+      <w:r>
+        <w:rPr>
+          <w:rFonts w:ascii="Times New Roman" w:hAnsi="Times New Roman" w:cs="Times New Roman"/>
+          <w:sz w:val="24"/>
+          <w:szCs w:val="24"/>
+        </w:rPr>
+        <w:t>sebenarnya</w:t>
+      </w:r>
+      <w:proofErr w:type="spellEnd"/>
+      <w:r>
+        <w:rPr>
+          <w:rFonts w:ascii="Times New Roman" w:hAnsi="Times New Roman" w:cs="Times New Roman"/>
+          <w:sz w:val="24"/>
+          <w:szCs w:val="24"/>
+        </w:rPr>
+        <w:t xml:space="preserve"> agar </w:t>
+      </w:r>
+      <w:proofErr w:type="spellStart"/>
+      <w:r>
+        <w:rPr>
+          <w:rFonts w:ascii="Times New Roman" w:hAnsi="Times New Roman" w:cs="Times New Roman"/>
+          <w:sz w:val="24"/>
+          <w:szCs w:val="24"/>
+        </w:rPr>
+        <w:t>dapat</w:t>
+      </w:r>
+      <w:proofErr w:type="spellEnd"/>
+      <w:r>
+        <w:rPr>
+          <w:rFonts w:ascii="Times New Roman" w:hAnsi="Times New Roman" w:cs="Times New Roman"/>
+          <w:sz w:val="24"/>
+          <w:szCs w:val="24"/>
+        </w:rPr>
+        <w:t xml:space="preserve"> </w:t>
+      </w:r>
+      <w:proofErr w:type="spellStart"/>
+      <w:r>
+        <w:rPr>
+          <w:rFonts w:ascii="Times New Roman" w:hAnsi="Times New Roman" w:cs="Times New Roman"/>
+          <w:sz w:val="24"/>
+          <w:szCs w:val="24"/>
+        </w:rPr>
+        <w:t>dipergunakan</w:t>
+      </w:r>
+      <w:proofErr w:type="spellEnd"/>
+      <w:r>
+        <w:rPr>
+          <w:rFonts w:ascii="Times New Roman" w:hAnsi="Times New Roman" w:cs="Times New Roman"/>
+          <w:sz w:val="24"/>
+          <w:szCs w:val="24"/>
+        </w:rPr>
+        <w:t xml:space="preserve"> </w:t>
+      </w:r>
+      <w:proofErr w:type="spellStart"/>
+      <w:r>
+        <w:rPr>
+          <w:rFonts w:ascii="Times New Roman" w:hAnsi="Times New Roman" w:cs="Times New Roman"/>
+          <w:sz w:val="24"/>
+          <w:szCs w:val="24"/>
+        </w:rPr>
+        <w:t>sebagaimana</w:t>
+      </w:r>
+      <w:proofErr w:type="spellEnd"/>
+      <w:r>
+        <w:rPr>
+          <w:rFonts w:ascii="Times New Roman" w:hAnsi="Times New Roman" w:cs="Times New Roman"/>
+          <w:sz w:val="24"/>
+          <w:szCs w:val="24"/>
+        </w:rPr>
+        <w:t xml:space="preserve"> </w:t>
+      </w:r>
+      <w:proofErr w:type="spellStart"/>
+      <w:r>
+        <w:rPr>
+          <w:rFonts w:ascii="Times New Roman" w:hAnsi="Times New Roman" w:cs="Times New Roman"/>
+          <w:sz w:val="24"/>
+          <w:szCs w:val="24"/>
+        </w:rPr>
+        <w:t>mestinya</w:t>
+      </w:r>
+      <w:proofErr w:type="spellEnd"/>
+      <w:r>
+        <w:rPr>
+          <w:rFonts w:ascii="Times New Roman" w:hAnsi="Times New Roman" w:cs="Times New Roman"/>
+          <w:sz w:val="24"/>
+          <w:szCs w:val="24"/>
+        </w:rPr>
+        <w:t>.</w:t>
       </w:r>
     </w:p>
     <w:p>
@@ -556,7 +1430,25 @@
                 <w:sz w:val="24"/>
                 <w:szCs w:val="24"/>
               </w:rPr>
-              <w:t>Bandung, ${tanggal}</w:t>
+              <w:t>Bandung, ${</w:t>
+            </w:r>
+            <w:proofErr w:type="spellStart"/>
+            <w:r>
+              <w:rPr>
+                <w:rFonts w:ascii="Times New Roman" w:hAnsi="Times New Roman" w:cs="Times New Roman"/>
+                <w:sz w:val="24"/>
+                <w:szCs w:val="24"/>
+              </w:rPr>
+              <w:t>tanggal</w:t>
+            </w:r>
+            <w:proofErr w:type="spellEnd"/>
+            <w:r>
+              <w:rPr>
+                <w:rFonts w:ascii="Times New Roman" w:hAnsi="Times New Roman" w:cs="Times New Roman"/>
+                <w:sz w:val="24"/>
+                <w:szCs w:val="24"/>
+              </w:rPr>
+              <w:t>}</w:t>
             </w:r>
           </w:p>
         </w:tc>
@@ -587,7 +1479,25 @@
                 <w:sz w:val="24"/>
                 <w:szCs w:val="24"/>
               </w:rPr>
-              <w:t>Bagian Kemahasiswaan,</w:t>
+              <w:t xml:space="preserve">Bagian </w:t>
+            </w:r>
+            <w:proofErr w:type="spellStart"/>
+            <w:r>
+              <w:rPr>
+                <w:rFonts w:ascii="Times New Roman" w:hAnsi="Times New Roman" w:cs="Times New Roman"/>
+                <w:sz w:val="24"/>
+                <w:szCs w:val="24"/>
+              </w:rPr>
+              <w:t>Kemahasiswaan</w:t>
+            </w:r>
+            <w:proofErr w:type="spellEnd"/>
+            <w:r>
+              <w:rPr>
+                <w:rFonts w:ascii="Times New Roman" w:hAnsi="Times New Roman" w:cs="Times New Roman"/>
+                <w:sz w:val="24"/>
+                <w:szCs w:val="24"/>
+              </w:rPr>
+              <w:t>,</w:t>
             </w:r>
           </w:p>
         </w:tc>

</xml_diff>

<commit_message>
chore: update template surat docx files
</commit_message>
<xml_diff>
--- a/Template surat/Surat_Keterangan_Tidak_Menerima_Beasiswa.docx
+++ b/Template surat/Surat_Keterangan_Tidak_Menerima_Beasiswa.docx
@@ -7,7 +7,7 @@
         <w:tabs>
           <w:tab w:val="right" w:pos="9806"/>
         </w:tabs>
-        <w:spacing w:after="714"/>
+        <w:spacing w:after="714" w:line="360" w:lineRule="auto"/>
         <w:rPr>
           <w:rFonts w:ascii="Times New Roman" w:hAnsi="Times New Roman" w:cs="Times New Roman"/>
           <w:sz w:val="24"/>
@@ -104,7 +104,7 @@
         <w:tabs>
           <w:tab w:val="right" w:pos="9806"/>
         </w:tabs>
-        <w:spacing w:after="0" w:line="240" w:lineRule="auto"/>
+        <w:spacing w:after="0" w:line="360" w:lineRule="auto"/>
         <w:jc w:val="center"/>
         <w:rPr>
           <w:rFonts w:ascii="Times New Roman" w:hAnsi="Times New Roman" w:cs="Times New Roman"/>
@@ -197,7 +197,7 @@
         <w:tabs>
           <w:tab w:val="right" w:pos="9806"/>
         </w:tabs>
-        <w:spacing w:after="0" w:line="240" w:lineRule="auto"/>
+        <w:spacing w:after="0" w:line="360" w:lineRule="auto"/>
         <w:jc w:val="center"/>
         <w:rPr>
           <w:rFonts w:ascii="Times New Roman" w:hAnsi="Times New Roman" w:cs="Times New Roman"/>
@@ -339,7 +339,7 @@
     </w:p>
     <w:p>
       <w:pPr>
-        <w:spacing w:line="360" w:lineRule="auto"/>
+        <w:spacing w:after="0" w:line="360" w:lineRule="auto"/>
         <w:ind w:left="426"/>
         <w:rPr>
           <w:rFonts w:ascii="Times New Roman" w:hAnsi="Times New Roman" w:cs="Times New Roman"/>
@@ -393,7 +393,7 @@
     </w:p>
     <w:p>
       <w:pPr>
-        <w:spacing w:line="360" w:lineRule="auto"/>
+        <w:spacing w:after="0" w:line="360" w:lineRule="auto"/>
         <w:ind w:left="426"/>
         <w:rPr>
           <w:rFonts w:ascii="Times New Roman" w:hAnsi="Times New Roman" w:cs="Times New Roman"/>
@@ -447,7 +447,7 @@
     </w:p>
     <w:p>
       <w:pPr>
-        <w:spacing w:line="360" w:lineRule="auto"/>
+        <w:spacing w:after="0" w:line="360" w:lineRule="auto"/>
         <w:ind w:left="426"/>
         <w:rPr>
           <w:rFonts w:ascii="Times New Roman" w:hAnsi="Times New Roman" w:cs="Times New Roman"/>
@@ -1036,7 +1036,7 @@
     </w:p>
     <w:p>
       <w:pPr>
-        <w:spacing w:before="240" w:line="360" w:lineRule="auto"/>
+        <w:spacing w:before="240" w:after="0" w:line="360" w:lineRule="auto"/>
         <w:ind w:left="426"/>
         <w:jc w:val="both"/>
         <w:rPr>

</xml_diff>